<commit_message>
Docs: Updated Testing Report and xlsx
</commit_message>
<xml_diff>
--- a/reports/Group/C3/Testing report.docx
+++ b/reports/Group/C3/Testing report.docx
@@ -4,7 +4,7 @@
   <w:body>
     <w:p>
       <w:pPr>
-        <w:pStyle w:val="Ttulo"/>
+        <w:pStyle w:val="Title"/>
         <w:jc w:val="center"/>
         <w:rPr>
           <w:sz w:val="72"/>
@@ -108,9 +108,9 @@
       <w:hyperlink r:id="rId9" w:history="1">
         <w:r>
           <w:rPr>
-            <w:rStyle w:val="Hipervnculo"/>
-          </w:rPr>
-          <w:t>Acme-ANS-C2</w:t>
+            <w:rStyle w:val="Hyperlink"/>
+          </w:rPr>
+          <w:t>Acme-ANS-C3</w:t>
         </w:r>
       </w:hyperlink>
       <w:r>
@@ -120,7 +120,10 @@
         <w:t>https://github.com/FernandoTC18/Acme-ANS-</w:t>
       </w:r>
       <w:r>
-        <w:t>C2</w:t>
+        <w:t>C</w:t>
+      </w:r>
+      <w:r>
+        <w:t>3</w:t>
       </w:r>
       <w:r>
         <w:t>)</w:t>
@@ -160,14 +163,21 @@
           <w:b/>
           <w:bCs/>
         </w:rPr>
-        <w:t>2</w:t>
+        <w:t>3</w:t>
       </w:r>
       <w:r>
         <w:rPr>
           <w:b/>
           <w:bCs/>
         </w:rPr>
-        <w:t>.007</w:t>
+        <w:t>.00</w:t>
+      </w:r>
+      <w:r>
+        <w:rPr>
+          <w:b/>
+          <w:bCs/>
+        </w:rPr>
+        <w:t>6</w:t>
       </w:r>
     </w:p>
     <w:p>
@@ -190,85 +200,22 @@
     <w:p/>
     <w:p>
       <w:pPr>
-        <w:pStyle w:val="Prrafodelista"/>
+        <w:pStyle w:val="ListParagraph"/>
         <w:numPr>
           <w:ilvl w:val="0"/>
           <w:numId w:val="1"/>
         </w:numPr>
       </w:pPr>
       <w:r>
-        <w:t>Peter Philip Cárter González (</w:t>
-      </w:r>
-      <w:r>
-        <w:t>petcargon@alum.us.es</w:t>
+        <w:t>Samuel Tamayo Balogh (</w:t>
+      </w:r>
+      <w:r>
+        <w:t>samtambal@alum.us.es</w:t>
       </w:r>
       <w:r>
         <w:t>)</w:t>
       </w:r>
     </w:p>
-    <w:p>
-      <w:pPr>
-        <w:pStyle w:val="Prrafodelista"/>
-        <w:numPr>
-          <w:ilvl w:val="0"/>
-          <w:numId w:val="1"/>
-        </w:numPr>
-      </w:pPr>
-      <w:r>
-        <w:t>Julián Romero Parejo (</w:t>
-      </w:r>
-      <w:r>
-        <w:t>julrompar@alum.us.es</w:t>
-      </w:r>
-      <w:r>
-        <w:t>)</w:t>
-      </w:r>
-    </w:p>
-    <w:p>
-      <w:pPr>
-        <w:pStyle w:val="Prrafodelista"/>
-        <w:numPr>
-          <w:ilvl w:val="0"/>
-          <w:numId w:val="1"/>
-        </w:numPr>
-      </w:pPr>
-      <w:r>
-        <w:t xml:space="preserve">Samuel Tamayo </w:t>
-      </w:r>
-      <w:proofErr w:type="spellStart"/>
-      <w:r>
-        <w:t>Balogh</w:t>
-      </w:r>
-      <w:proofErr w:type="spellEnd"/>
-      <w:r>
-        <w:t xml:space="preserve"> (</w:t>
-      </w:r>
-      <w:r>
-        <w:t>samtambal@alum.us.es</w:t>
-      </w:r>
-      <w:r>
-        <w:t>)</w:t>
-      </w:r>
-    </w:p>
-    <w:p>
-      <w:pPr>
-        <w:pStyle w:val="Prrafodelista"/>
-        <w:numPr>
-          <w:ilvl w:val="0"/>
-          <w:numId w:val="1"/>
-        </w:numPr>
-      </w:pPr>
-      <w:r>
-        <w:t>Fernando Triguero Caballo (</w:t>
-      </w:r>
-      <w:r>
-        <w:t>fertricab@alum.us.es</w:t>
-      </w:r>
-      <w:r>
-        <w:t>)</w:t>
-      </w:r>
-    </w:p>
-    <w:p/>
     <w:p>
       <w:pPr>
         <w:tabs>
@@ -282,7 +229,7 @@
     <w:p/>
     <w:p>
       <w:pPr>
-        <w:pStyle w:val="TDC1"/>
+        <w:pStyle w:val="TOC1"/>
         <w:tabs>
           <w:tab w:val="left" w:pos="480"/>
           <w:tab w:val="right" w:leader="underscore" w:pos="8494"/>
@@ -309,7 +256,7 @@
       <w:hyperlink w:anchor="_Toc202439981" w:history="1">
         <w:r>
           <w:rPr>
-            <w:rStyle w:val="Hipervnculo"/>
+            <w:rStyle w:val="Hyperlink"/>
             <w:noProof/>
           </w:rPr>
           <w:t>1.</w:t>
@@ -328,7 +275,7 @@
         </w:r>
         <w:r>
           <w:rPr>
-            <w:rStyle w:val="Hipervnculo"/>
+            <w:rStyle w:val="Hyperlink"/>
             <w:noProof/>
           </w:rPr>
           <w:t>Historial de versiones</w:t>
@@ -385,7 +332,7 @@
     </w:p>
     <w:p>
       <w:pPr>
-        <w:pStyle w:val="TDC1"/>
+        <w:pStyle w:val="TOC1"/>
         <w:tabs>
           <w:tab w:val="left" w:pos="480"/>
           <w:tab w:val="right" w:leader="underscore" w:pos="8494"/>
@@ -403,7 +350,7 @@
       <w:hyperlink w:anchor="_Toc202439982" w:history="1">
         <w:r>
           <w:rPr>
-            <w:rStyle w:val="Hipervnculo"/>
+            <w:rStyle w:val="Hyperlink"/>
             <w:noProof/>
           </w:rPr>
           <w:t>2.</w:t>
@@ -422,7 +369,7 @@
         </w:r>
         <w:r>
           <w:rPr>
-            <w:rStyle w:val="Hipervnculo"/>
+            <w:rStyle w:val="Hyperlink"/>
             <w:noProof/>
           </w:rPr>
           <w:t>Resumen ejecutivo</w:t>
@@ -479,7 +426,7 @@
     </w:p>
     <w:p>
       <w:pPr>
-        <w:pStyle w:val="TDC1"/>
+        <w:pStyle w:val="TOC1"/>
         <w:tabs>
           <w:tab w:val="left" w:pos="480"/>
           <w:tab w:val="right" w:leader="underscore" w:pos="8494"/>
@@ -497,7 +444,7 @@
       <w:hyperlink w:anchor="_Toc202439983" w:history="1">
         <w:r>
           <w:rPr>
-            <w:rStyle w:val="Hipervnculo"/>
+            <w:rStyle w:val="Hyperlink"/>
             <w:noProof/>
           </w:rPr>
           <w:t>3.</w:t>
@@ -516,7 +463,7 @@
         </w:r>
         <w:r>
           <w:rPr>
-            <w:rStyle w:val="Hipervnculo"/>
+            <w:rStyle w:val="Hyperlink"/>
             <w:noProof/>
           </w:rPr>
           <w:t>Introducción</w:t>
@@ -573,7 +520,7 @@
     </w:p>
     <w:p>
       <w:pPr>
-        <w:pStyle w:val="TDC1"/>
+        <w:pStyle w:val="TOC1"/>
         <w:tabs>
           <w:tab w:val="left" w:pos="480"/>
           <w:tab w:val="right" w:leader="underscore" w:pos="8494"/>
@@ -591,7 +538,7 @@
       <w:hyperlink w:anchor="_Toc202439984" w:history="1">
         <w:r>
           <w:rPr>
-            <w:rStyle w:val="Hipervnculo"/>
+            <w:rStyle w:val="Hyperlink"/>
             <w:noProof/>
           </w:rPr>
           <w:t>4.</w:t>
@@ -610,7 +557,7 @@
         </w:r>
         <w:r>
           <w:rPr>
-            <w:rStyle w:val="Hipervnculo"/>
+            <w:rStyle w:val="Hyperlink"/>
             <w:noProof/>
           </w:rPr>
           <w:t>Contenido del informe</w:t>
@@ -667,7 +614,7 @@
     </w:p>
     <w:p>
       <w:pPr>
-        <w:pStyle w:val="TDC2"/>
+        <w:pStyle w:val="TOC2"/>
         <w:tabs>
           <w:tab w:val="left" w:pos="720"/>
           <w:tab w:val="right" w:leader="underscore" w:pos="8494"/>
@@ -685,7 +632,7 @@
       <w:hyperlink w:anchor="_Toc202439985" w:history="1">
         <w:r>
           <w:rPr>
-            <w:rStyle w:val="Hipervnculo"/>
+            <w:rStyle w:val="Hyperlink"/>
             <w:noProof/>
           </w:rPr>
           <w:t>a.</w:t>
@@ -704,7 +651,7 @@
         </w:r>
         <w:r>
           <w:rPr>
-            <w:rStyle w:val="Hipervnculo"/>
+            <w:rStyle w:val="Hyperlink"/>
             <w:noProof/>
           </w:rPr>
           <w:t>Testing funcional</w:t>
@@ -761,7 +708,7 @@
     </w:p>
     <w:p>
       <w:pPr>
-        <w:pStyle w:val="TDC3"/>
+        <w:pStyle w:val="TOC3"/>
         <w:tabs>
           <w:tab w:val="left" w:pos="960"/>
           <w:tab w:val="right" w:leader="underscore" w:pos="8494"/>
@@ -777,7 +724,7 @@
       <w:hyperlink w:anchor="_Toc202439986" w:history="1">
         <w:r>
           <w:rPr>
-            <w:rStyle w:val="Hipervnculo"/>
+            <w:rStyle w:val="Hyperlink"/>
             <w:noProof/>
           </w:rPr>
           <w:t>i.</w:t>
@@ -794,7 +741,7 @@
         </w:r>
         <w:r>
           <w:rPr>
-            <w:rStyle w:val="Hipervnculo"/>
+            <w:rStyle w:val="Hyperlink"/>
             <w:noProof/>
           </w:rPr>
           <w:t>Casos de prueba para Airport</w:t>
@@ -851,7 +798,7 @@
     </w:p>
     <w:p>
       <w:pPr>
-        <w:pStyle w:val="TDC2"/>
+        <w:pStyle w:val="TOC2"/>
         <w:tabs>
           <w:tab w:val="left" w:pos="720"/>
           <w:tab w:val="right" w:leader="underscore" w:pos="8494"/>
@@ -869,7 +816,7 @@
       <w:hyperlink w:anchor="_Toc202439987" w:history="1">
         <w:r>
           <w:rPr>
-            <w:rStyle w:val="Hipervnculo"/>
+            <w:rStyle w:val="Hyperlink"/>
             <w:noProof/>
           </w:rPr>
           <w:t>b.</w:t>
@@ -888,10 +835,24 @@
         </w:r>
         <w:r>
           <w:rPr>
-            <w:rStyle w:val="Hipervnculo"/>
-            <w:noProof/>
-          </w:rPr>
-          <w:t>Pruebas de rendimiento (Performance testing)</w:t>
+            <w:rStyle w:val="Hyperlink"/>
+            <w:noProof/>
+          </w:rPr>
+          <w:t>Pruebas de re</w:t>
+        </w:r>
+        <w:r>
+          <w:rPr>
+            <w:rStyle w:val="Hyperlink"/>
+            <w:noProof/>
+          </w:rPr>
+          <w:t>n</w:t>
+        </w:r>
+        <w:r>
+          <w:rPr>
+            <w:rStyle w:val="Hyperlink"/>
+            <w:noProof/>
+          </w:rPr>
+          <w:t>dimiento (Performance testing)</w:t>
         </w:r>
         <w:r>
           <w:rPr>
@@ -945,7 +906,7 @@
     </w:p>
     <w:p>
       <w:pPr>
-        <w:pStyle w:val="TDC3"/>
+        <w:pStyle w:val="TOC3"/>
         <w:tabs>
           <w:tab w:val="left" w:pos="960"/>
           <w:tab w:val="right" w:leader="underscore" w:pos="8494"/>
@@ -961,7 +922,7 @@
       <w:hyperlink w:anchor="_Toc202439988" w:history="1">
         <w:r>
           <w:rPr>
-            <w:rStyle w:val="Hipervnculo"/>
+            <w:rStyle w:val="Hyperlink"/>
             <w:noProof/>
           </w:rPr>
           <w:t>i.</w:t>
@@ -978,7 +939,7 @@
         </w:r>
         <w:r>
           <w:rPr>
-            <w:rStyle w:val="Hipervnculo"/>
+            <w:rStyle w:val="Hyperlink"/>
             <w:noProof/>
           </w:rPr>
           <w:t>Resultados del PC1</w:t>
@@ -1035,7 +996,7 @@
     </w:p>
     <w:p>
       <w:pPr>
-        <w:pStyle w:val="TDC3"/>
+        <w:pStyle w:val="TOC3"/>
         <w:tabs>
           <w:tab w:val="left" w:pos="960"/>
           <w:tab w:val="right" w:leader="underscore" w:pos="8494"/>
@@ -1051,7 +1012,7 @@
       <w:hyperlink w:anchor="_Toc202439989" w:history="1">
         <w:r>
           <w:rPr>
-            <w:rStyle w:val="Hipervnculo"/>
+            <w:rStyle w:val="Hyperlink"/>
             <w:noProof/>
           </w:rPr>
           <w:t>ii.</w:t>
@@ -1068,7 +1029,7 @@
         </w:r>
         <w:r>
           <w:rPr>
-            <w:rStyle w:val="Hipervnculo"/>
+            <w:rStyle w:val="Hyperlink"/>
             <w:noProof/>
           </w:rPr>
           <w:t>Resultados del PC2</w:t>
@@ -1125,7 +1086,7 @@
     </w:p>
     <w:p>
       <w:pPr>
-        <w:pStyle w:val="TDC3"/>
+        <w:pStyle w:val="TOC3"/>
         <w:tabs>
           <w:tab w:val="left" w:pos="960"/>
           <w:tab w:val="right" w:leader="underscore" w:pos="8494"/>
@@ -1141,7 +1102,7 @@
       <w:hyperlink w:anchor="_Toc202439990" w:history="1">
         <w:r>
           <w:rPr>
-            <w:rStyle w:val="Hipervnculo"/>
+            <w:rStyle w:val="Hyperlink"/>
             <w:noProof/>
           </w:rPr>
           <w:t>iii.</w:t>
@@ -1158,7 +1119,7 @@
         </w:r>
         <w:r>
           <w:rPr>
-            <w:rStyle w:val="Hipervnculo"/>
+            <w:rStyle w:val="Hyperlink"/>
             <w:noProof/>
           </w:rPr>
           <w:t>Comparación entre los datos de los dos ordenadores</w:t>
@@ -1215,7 +1176,7 @@
     </w:p>
     <w:p>
       <w:pPr>
-        <w:pStyle w:val="TDC1"/>
+        <w:pStyle w:val="TOC1"/>
         <w:tabs>
           <w:tab w:val="left" w:pos="480"/>
           <w:tab w:val="right" w:leader="underscore" w:pos="8494"/>
@@ -1233,7 +1194,7 @@
       <w:hyperlink w:anchor="_Toc202439991" w:history="1">
         <w:r>
           <w:rPr>
-            <w:rStyle w:val="Hipervnculo"/>
+            <w:rStyle w:val="Hyperlink"/>
             <w:noProof/>
           </w:rPr>
           <w:t>5.</w:t>
@@ -1252,7 +1213,7 @@
         </w:r>
         <w:r>
           <w:rPr>
-            <w:rStyle w:val="Hipervnculo"/>
+            <w:rStyle w:val="Hyperlink"/>
             <w:noProof/>
           </w:rPr>
           <w:t>Conclusión</w:t>
@@ -1309,7 +1270,7 @@
     </w:p>
     <w:p>
       <w:pPr>
-        <w:pStyle w:val="TDC1"/>
+        <w:pStyle w:val="TOC1"/>
         <w:tabs>
           <w:tab w:val="left" w:pos="480"/>
           <w:tab w:val="right" w:leader="underscore" w:pos="8494"/>
@@ -1327,7 +1288,7 @@
       <w:hyperlink w:anchor="_Toc202439992" w:history="1">
         <w:r>
           <w:rPr>
-            <w:rStyle w:val="Hipervnculo"/>
+            <w:rStyle w:val="Hyperlink"/>
             <w:noProof/>
           </w:rPr>
           <w:t>6.</w:t>
@@ -1346,7 +1307,7 @@
         </w:r>
         <w:r>
           <w:rPr>
-            <w:rStyle w:val="Hipervnculo"/>
+            <w:rStyle w:val="Hyperlink"/>
             <w:noProof/>
           </w:rPr>
           <w:t>Bibliografía</w:t>
@@ -1416,7 +1377,7 @@
     </w:p>
     <w:p>
       <w:pPr>
-        <w:pStyle w:val="Ttulo1"/>
+        <w:pStyle w:val="Heading1"/>
       </w:pPr>
       <w:bookmarkStart w:id="1" w:name="_Toc202439981"/>
       <w:r>
@@ -1429,7 +1390,7 @@
     <w:p/>
     <w:tbl>
       <w:tblPr>
-        <w:tblStyle w:val="Tablaconcuadrcula"/>
+        <w:tblStyle w:val="TableGrid"/>
         <w:tblW w:w="0" w:type="auto"/>
         <w:jc w:val="center"/>
         <w:tblLook w:val="04A0" w:firstRow="1" w:lastRow="0" w:firstColumn="1" w:lastColumn="0" w:noHBand="0" w:noVBand="1"/>
@@ -1621,6 +1582,56 @@
           </w:p>
         </w:tc>
       </w:tr>
+      <w:tr>
+        <w:trPr>
+          <w:jc w:val="center"/>
+        </w:trPr>
+        <w:tc>
+          <w:tcPr>
+            <w:tcW w:w="2831" w:type="dxa"/>
+          </w:tcPr>
+          <w:p>
+            <w:pPr>
+              <w:jc w:val="center"/>
+            </w:pPr>
+            <w:r>
+              <w:t>15-10-25</w:t>
+            </w:r>
+          </w:p>
+        </w:tc>
+        <w:tc>
+          <w:tcPr>
+            <w:tcW w:w="2831" w:type="dxa"/>
+          </w:tcPr>
+          <w:p>
+            <w:pPr>
+              <w:jc w:val="center"/>
+            </w:pPr>
+            <w:r>
+              <w:t>1.2</w:t>
+            </w:r>
+          </w:p>
+        </w:tc>
+        <w:tc>
+          <w:tcPr>
+            <w:tcW w:w="2832" w:type="dxa"/>
+          </w:tcPr>
+          <w:p>
+            <w:pPr>
+              <w:jc w:val="center"/>
+            </w:pPr>
+            <w:r>
+              <w:t xml:space="preserve">Cambios correspondientes a la </w:t>
+            </w:r>
+            <w:r>
+              <w:t>tercera</w:t>
+            </w:r>
+            <w:r>
+              <w:t xml:space="preserve"> convocatoria</w:t>
+            </w:r>
+          </w:p>
+        </w:tc>
+      </w:tr>
     </w:tbl>
     <w:p/>
     <w:p/>
@@ -1636,7 +1647,7 @@
     </w:p>
     <w:p>
       <w:pPr>
-        <w:pStyle w:val="Ttulo1"/>
+        <w:pStyle w:val="Heading1"/>
       </w:pPr>
       <w:bookmarkStart w:id="2" w:name="_Toc202439982"/>
       <w:r>
@@ -1702,38 +1713,65 @@
     <w:p/>
     <w:p>
       <w:pPr>
-        <w:pStyle w:val="Prrafodelista"/>
+        <w:pStyle w:val="ListParagraph"/>
         <w:numPr>
           <w:ilvl w:val="0"/>
           <w:numId w:val="1"/>
         </w:numPr>
-      </w:pPr>
-      <w:r>
+        <w:rPr>
+          <w:lang w:val="pt-PT"/>
+        </w:rPr>
+      </w:pPr>
+      <w:r>
+        <w:rPr>
+          <w:lang w:val="pt-PT"/>
+        </w:rPr>
         <w:t>AMD Ryzen 7 5800x, 32GB RAM, 8 núcleos CPU, Windows 11 24H2</w:t>
       </w:r>
     </w:p>
-    <w:p/>
-    <w:p>
-      <w:pPr>
-        <w:pStyle w:val="Prrafodelista"/>
+    <w:p>
+      <w:pPr>
+        <w:rPr>
+          <w:lang w:val="pt-PT"/>
+        </w:rPr>
+      </w:pPr>
+    </w:p>
+    <w:p>
+      <w:pPr>
+        <w:pStyle w:val="ListParagraph"/>
         <w:numPr>
           <w:ilvl w:val="0"/>
           <w:numId w:val="1"/>
         </w:numPr>
-      </w:pPr>
-      <w:r>
+        <w:rPr>
+          <w:lang w:val="pt-PT"/>
+        </w:rPr>
+      </w:pPr>
+      <w:r>
+        <w:rPr>
+          <w:lang w:val="pt-PT"/>
+        </w:rPr>
         <w:t>MacBook Air M1 2020, 8GB RAM,</w:t>
       </w:r>
       <w:r>
+        <w:rPr>
+          <w:lang w:val="pt-PT"/>
+        </w:rPr>
         <w:t xml:space="preserve"> 8 núcleos CPU,</w:t>
       </w:r>
       <w:r>
+        <w:rPr>
+          <w:lang w:val="pt-PT"/>
+        </w:rPr>
         <w:t xml:space="preserve"> MacOS Sequoia 15.5</w:t>
       </w:r>
     </w:p>
     <w:p>
       <w:pPr>
         <w:ind w:left="360"/>
+        <w:rPr>
+          <w:lang w:val="pt-PT"/>
+        </w:rPr>
       </w:pPr>
     </w:p>
     <w:p>
@@ -1785,7 +1823,7 @@
     </w:p>
     <w:p>
       <w:pPr>
-        <w:pStyle w:val="Ttulo1"/>
+        <w:pStyle w:val="Heading1"/>
       </w:pPr>
       <w:bookmarkStart w:id="3" w:name="_Toc202439983"/>
       <w:r>
@@ -1858,7 +1896,7 @@
     <w:p/>
     <w:p>
       <w:pPr>
-        <w:pStyle w:val="Prrafodelista"/>
+        <w:pStyle w:val="ListParagraph"/>
         <w:numPr>
           <w:ilvl w:val="0"/>
           <w:numId w:val="1"/>
@@ -1871,7 +1909,7 @@
     <w:p/>
     <w:p>
       <w:pPr>
-        <w:pStyle w:val="Prrafodelista"/>
+        <w:pStyle w:val="ListParagraph"/>
         <w:numPr>
           <w:ilvl w:val="0"/>
           <w:numId w:val="1"/>
@@ -1944,7 +1982,7 @@
     </w:p>
     <w:p>
       <w:pPr>
-        <w:pStyle w:val="Ttulo1"/>
+        <w:pStyle w:val="Heading1"/>
       </w:pPr>
       <w:bookmarkStart w:id="4" w:name="_Toc202439984"/>
       <w:r>
@@ -1961,7 +1999,7 @@
     <w:p/>
     <w:p>
       <w:pPr>
-        <w:pStyle w:val="Ttulo2"/>
+        <w:pStyle w:val="Heading2"/>
         <w:ind w:hanging="1298"/>
       </w:pPr>
       <w:bookmarkStart w:id="5" w:name="_Toc202439985"/>
@@ -1973,7 +2011,7 @@
     <w:p/>
     <w:p>
       <w:pPr>
-        <w:pStyle w:val="Ttulo3"/>
+        <w:pStyle w:val="Heading3"/>
         <w:ind w:hanging="1734"/>
       </w:pPr>
       <w:bookmarkStart w:id="6" w:name="_Toc202439986"/>
@@ -1990,7 +2028,7 @@
     <w:p/>
     <w:tbl>
       <w:tblPr>
-        <w:tblStyle w:val="Tablaconcuadrcula"/>
+        <w:tblStyle w:val="TableGrid"/>
         <w:tblW w:w="0" w:type="auto"/>
         <w:tblLook w:val="04A0" w:firstRow="1" w:lastRow="0" w:firstColumn="1" w:lastColumn="0" w:noHBand="0" w:noVBand="1"/>
       </w:tblPr>
@@ -2319,7 +2357,7 @@
     <w:p/>
     <w:p>
       <w:pPr>
-        <w:pStyle w:val="Ttulo3"/>
+        <w:pStyle w:val="Heading3"/>
         <w:numPr>
           <w:ilvl w:val="0"/>
           <w:numId w:val="0"/>
@@ -2332,7 +2370,7 @@
     </w:p>
     <w:p>
       <w:pPr>
-        <w:pStyle w:val="Ttulo2"/>
+        <w:pStyle w:val="Heading2"/>
         <w:ind w:left="426" w:hanging="426"/>
       </w:pPr>
       <w:bookmarkStart w:id="7" w:name="_Toc202439987"/>
@@ -2353,7 +2391,7 @@
     <w:p/>
     <w:p>
       <w:pPr>
-        <w:pStyle w:val="Ttulo3"/>
+        <w:pStyle w:val="Heading3"/>
         <w:tabs>
           <w:tab w:val="clear" w:pos="520"/>
           <w:tab w:val="left" w:pos="284"/>
@@ -2378,7 +2416,7 @@
     <w:p/>
     <w:tbl>
       <w:tblPr>
-        <w:tblStyle w:val="Tablaconcuadrcula"/>
+        <w:tblStyle w:val="TableGrid"/>
         <w:tblW w:w="0" w:type="auto"/>
         <w:tblLook w:val="04A0" w:firstRow="1" w:lastRow="0" w:firstColumn="1" w:lastColumn="0" w:noHBand="0" w:noVBand="1"/>
       </w:tblPr>
@@ -3154,7 +3192,7 @@
     </w:p>
     <w:tbl>
       <w:tblPr>
-        <w:tblStyle w:val="Tablaconcuadrcula"/>
+        <w:tblStyle w:val="TableGrid"/>
         <w:tblW w:w="0" w:type="auto"/>
         <w:tblLook w:val="04A0" w:firstRow="1" w:lastRow="0" w:firstColumn="1" w:lastColumn="0" w:noHBand="0" w:noVBand="1"/>
       </w:tblPr>
@@ -3643,7 +3681,7 @@
     </w:p>
     <w:tbl>
       <w:tblPr>
-        <w:tblStyle w:val="Tablaconcuadrcula"/>
+        <w:tblStyle w:val="TableGrid"/>
         <w:tblW w:w="0" w:type="auto"/>
         <w:tblLook w:val="04A0" w:firstRow="1" w:lastRow="0" w:firstColumn="1" w:lastColumn="0" w:noHBand="0" w:noVBand="1"/>
       </w:tblPr>
@@ -3762,7 +3800,7 @@
     </w:p>
     <w:p>
       <w:pPr>
-        <w:pStyle w:val="Ttulo3"/>
+        <w:pStyle w:val="Heading3"/>
         <w:tabs>
           <w:tab w:val="clear" w:pos="520"/>
           <w:tab w:val="left" w:pos="426"/>
@@ -3795,7 +3833,7 @@
     <w:p/>
     <w:tbl>
       <w:tblPr>
-        <w:tblStyle w:val="Tablaconcuadrcula"/>
+        <w:tblStyle w:val="TableGrid"/>
         <w:tblW w:w="0" w:type="auto"/>
         <w:tblLook w:val="04A0" w:firstRow="1" w:lastRow="0" w:firstColumn="1" w:lastColumn="0" w:noHBand="0" w:noVBand="1"/>
       </w:tblPr>
@@ -4596,7 +4634,7 @@
     <w:p/>
     <w:tbl>
       <w:tblPr>
-        <w:tblStyle w:val="Tablaconcuadrcula"/>
+        <w:tblStyle w:val="TableGrid"/>
         <w:tblW w:w="0" w:type="auto"/>
         <w:tblLook w:val="04A0" w:firstRow="1" w:lastRow="0" w:firstColumn="1" w:lastColumn="0" w:noHBand="0" w:noVBand="1"/>
       </w:tblPr>
@@ -5085,7 +5123,7 @@
     </w:p>
     <w:tbl>
       <w:tblPr>
-        <w:tblStyle w:val="Tablaconcuadrcula"/>
+        <w:tblStyle w:val="TableGrid"/>
         <w:tblW w:w="0" w:type="auto"/>
         <w:tblLook w:val="04A0" w:firstRow="1" w:lastRow="0" w:firstColumn="1" w:lastColumn="0" w:noHBand="0" w:noVBand="1"/>
       </w:tblPr>
@@ -5214,7 +5252,7 @@
     </w:p>
     <w:p>
       <w:pPr>
-        <w:pStyle w:val="Ttulo3"/>
+        <w:pStyle w:val="Heading3"/>
         <w:tabs>
           <w:tab w:val="clear" w:pos="520"/>
           <w:tab w:val="left" w:pos="426"/>
@@ -5246,7 +5284,7 @@
     <w:p/>
     <w:tbl>
       <w:tblPr>
-        <w:tblStyle w:val="Tablaconcuadrcula"/>
+        <w:tblStyle w:val="TableGrid"/>
         <w:tblW w:w="0" w:type="auto"/>
         <w:tblLook w:val="04A0" w:firstRow="1" w:lastRow="0" w:firstColumn="1" w:lastColumn="0" w:noHBand="0" w:noVBand="1"/>
       </w:tblPr>
@@ -5662,12 +5700,13 @@
               <w:jc w:val="center"/>
               <w:rPr>
                 <w:color w:val="000000"/>
-                <w:lang w:val="es-ES"/>
-              </w:rPr>
-            </w:pPr>
-            <w:r>
-              <w:rPr>
-                <w:color w:val="000000"/>
+                <w:lang w:val="pt-PT"/>
+              </w:rPr>
+            </w:pPr>
+            <w:r>
+              <w:rPr>
+                <w:color w:val="000000"/>
+                <w:lang w:val="pt-PT"/>
               </w:rPr>
               <w:t>P(Z&lt;=z) dos colas</w:t>
             </w:r>
@@ -5708,11 +5747,13 @@
               <w:jc w:val="center"/>
               <w:rPr>
                 <w:highlight w:val="yellow"/>
-              </w:rPr>
-            </w:pPr>
-            <w:r>
-              <w:rPr>
-                <w:color w:val="000000"/>
+                <w:lang w:val="pt-PT"/>
+              </w:rPr>
+            </w:pPr>
+            <w:r>
+              <w:rPr>
+                <w:color w:val="000000"/>
+                <w:lang w:val="pt-PT"/>
               </w:rPr>
               <w:t>Valor crítico de z (dos colas)</w:t>
             </w:r>
@@ -5848,7 +5889,7 @@
     </w:p>
     <w:p>
       <w:pPr>
-        <w:pStyle w:val="Ttulo1"/>
+        <w:pStyle w:val="Heading1"/>
       </w:pPr>
       <w:bookmarkStart w:id="11" w:name="_Toc202439991"/>
       <w:r>
@@ -5907,7 +5948,7 @@
     </w:p>
     <w:p>
       <w:pPr>
-        <w:pStyle w:val="Ttulo1"/>
+        <w:pStyle w:val="Heading1"/>
       </w:pPr>
       <w:bookmarkStart w:id="12" w:name="_Toc202439992"/>
       <w:r>
@@ -5962,7 +6003,7 @@
   <w:sdt>
     <w:sdtPr>
       <w:rPr>
-        <w:rStyle w:val="Nmerodepgina"/>
+        <w:rStyle w:val="PageNumber"/>
       </w:rPr>
       <w:id w:val="1349754776"/>
       <w:docPartObj>
@@ -5973,33 +6014,33 @@
     <w:sdtContent>
       <w:p>
         <w:pPr>
-          <w:pStyle w:val="Piedepgina"/>
+          <w:pStyle w:val="Footer"/>
           <w:framePr w:wrap="none" w:vAnchor="text" w:hAnchor="margin" w:xAlign="right" w:y="1"/>
           <w:rPr>
-            <w:rStyle w:val="Nmerodepgina"/>
+            <w:rStyle w:val="PageNumber"/>
           </w:rPr>
         </w:pPr>
         <w:r>
           <w:rPr>
-            <w:rStyle w:val="Nmerodepgina"/>
+            <w:rStyle w:val="PageNumber"/>
           </w:rPr>
           <w:fldChar w:fldCharType="begin"/>
         </w:r>
         <w:r>
           <w:rPr>
-            <w:rStyle w:val="Nmerodepgina"/>
+            <w:rStyle w:val="PageNumber"/>
           </w:rPr>
           <w:instrText xml:space="preserve"> PAGE </w:instrText>
         </w:r>
         <w:r>
           <w:rPr>
-            <w:rStyle w:val="Nmerodepgina"/>
+            <w:rStyle w:val="PageNumber"/>
           </w:rPr>
           <w:fldChar w:fldCharType="separate"/>
         </w:r>
         <w:r>
           <w:rPr>
-            <w:rStyle w:val="Nmerodepgina"/>
+            <w:rStyle w:val="PageNumber"/>
           </w:rPr>
           <w:fldChar w:fldCharType="end"/>
         </w:r>
@@ -6009,7 +6050,7 @@
   <w:sdt>
     <w:sdtPr>
       <w:rPr>
-        <w:rStyle w:val="Nmerodepgina"/>
+        <w:rStyle w:val="PageNumber"/>
       </w:rPr>
       <w:id w:val="889929446"/>
       <w:docPartObj>
@@ -6020,33 +6061,33 @@
     <w:sdtContent>
       <w:p>
         <w:pPr>
-          <w:pStyle w:val="Piedepgina"/>
+          <w:pStyle w:val="Footer"/>
           <w:ind w:right="360"/>
           <w:rPr>
-            <w:rStyle w:val="Nmerodepgina"/>
+            <w:rStyle w:val="PageNumber"/>
           </w:rPr>
         </w:pPr>
         <w:r>
           <w:rPr>
-            <w:rStyle w:val="Nmerodepgina"/>
+            <w:rStyle w:val="PageNumber"/>
           </w:rPr>
           <w:fldChar w:fldCharType="begin"/>
         </w:r>
         <w:r>
           <w:rPr>
-            <w:rStyle w:val="Nmerodepgina"/>
+            <w:rStyle w:val="PageNumber"/>
           </w:rPr>
           <w:instrText xml:space="preserve"> PAGE </w:instrText>
         </w:r>
         <w:r>
           <w:rPr>
-            <w:rStyle w:val="Nmerodepgina"/>
+            <w:rStyle w:val="PageNumber"/>
           </w:rPr>
           <w:fldChar w:fldCharType="separate"/>
         </w:r>
         <w:r>
           <w:rPr>
-            <w:rStyle w:val="Nmerodepgina"/>
+            <w:rStyle w:val="PageNumber"/>
           </w:rPr>
           <w:fldChar w:fldCharType="end"/>
         </w:r>
@@ -6055,7 +6096,7 @@
   </w:sdt>
   <w:p>
     <w:pPr>
-      <w:pStyle w:val="Piedepgina"/>
+      <w:pStyle w:val="Footer"/>
     </w:pPr>
   </w:p>
 </w:ftr>
@@ -6066,7 +6107,7 @@
   <w:sdt>
     <w:sdtPr>
       <w:rPr>
-        <w:rStyle w:val="Nmerodepgina"/>
+        <w:rStyle w:val="PageNumber"/>
       </w:rPr>
       <w:id w:val="772604698"/>
       <w:docPartObj>
@@ -6077,40 +6118,40 @@
     <w:sdtContent>
       <w:p>
         <w:pPr>
-          <w:pStyle w:val="Piedepgina"/>
+          <w:pStyle w:val="Footer"/>
           <w:framePr w:wrap="none" w:vAnchor="text" w:hAnchor="margin" w:xAlign="right" w:y="1"/>
           <w:rPr>
-            <w:rStyle w:val="Nmerodepgina"/>
+            <w:rStyle w:val="PageNumber"/>
           </w:rPr>
         </w:pPr>
         <w:r>
           <w:rPr>
-            <w:rStyle w:val="Nmerodepgina"/>
+            <w:rStyle w:val="PageNumber"/>
           </w:rPr>
           <w:fldChar w:fldCharType="begin"/>
         </w:r>
         <w:r>
           <w:rPr>
-            <w:rStyle w:val="Nmerodepgina"/>
+            <w:rStyle w:val="PageNumber"/>
           </w:rPr>
           <w:instrText xml:space="preserve"> PAGE </w:instrText>
         </w:r>
         <w:r>
           <w:rPr>
-            <w:rStyle w:val="Nmerodepgina"/>
+            <w:rStyle w:val="PageNumber"/>
           </w:rPr>
           <w:fldChar w:fldCharType="separate"/>
         </w:r>
         <w:r>
           <w:rPr>
-            <w:rStyle w:val="Nmerodepgina"/>
+            <w:rStyle w:val="PageNumber"/>
             <w:noProof/>
           </w:rPr>
           <w:t>1</w:t>
         </w:r>
         <w:r>
           <w:rPr>
-            <w:rStyle w:val="Nmerodepgina"/>
+            <w:rStyle w:val="PageNumber"/>
           </w:rPr>
           <w:fldChar w:fldCharType="end"/>
         </w:r>
@@ -6119,7 +6160,7 @@
   </w:sdt>
   <w:p>
     <w:pPr>
-      <w:pStyle w:val="Piedepgina"/>
+      <w:pStyle w:val="Footer"/>
       <w:ind w:right="360"/>
     </w:pPr>
   </w:p>
@@ -6303,7 +6344,7 @@
     <w:lvl w:ilvl="0" w:tplc="FA449976">
       <w:start w:val="1"/>
       <w:numFmt w:val="decimal"/>
-      <w:pStyle w:val="Ttulo1"/>
+      <w:pStyle w:val="Heading1"/>
       <w:lvlText w:val="%1."/>
       <w:lvlJc w:val="left"/>
       <w:pPr>
@@ -6313,7 +6354,7 @@
     <w:lvl w:ilvl="1" w:tplc="A0009DB8">
       <w:start w:val="1"/>
       <w:numFmt w:val="lowerLetter"/>
-      <w:pStyle w:val="Ttulo2"/>
+      <w:pStyle w:val="Heading2"/>
       <w:lvlText w:val="%2."/>
       <w:lvlJc w:val="left"/>
       <w:pPr>
@@ -6323,7 +6364,7 @@
     <w:lvl w:ilvl="2" w:tplc="E5AA5FD2">
       <w:start w:val="1"/>
       <w:numFmt w:val="lowerRoman"/>
-      <w:pStyle w:val="Ttulo3"/>
+      <w:pStyle w:val="Heading3"/>
       <w:lvlText w:val="%3."/>
       <w:lvlJc w:val="right"/>
       <w:pPr>
@@ -6916,11 +6957,11 @@
       <w:lang w:val="es-ES_tradnl"/>
     </w:rPr>
   </w:style>
-  <w:style w:type="paragraph" w:styleId="Ttulo1">
+  <w:style w:type="paragraph" w:styleId="Heading1">
     <w:name w:val="heading 1"/>
     <w:basedOn w:val="Normal"/>
     <w:next w:val="Normal"/>
-    <w:link w:val="Ttulo1Car"/>
+    <w:link w:val="Heading1Char"/>
     <w:uiPriority w:val="9"/>
     <w:qFormat/>
     <w:rsid w:val="006F116F"/>
@@ -6941,11 +6982,11 @@
       <w:szCs w:val="40"/>
     </w:rPr>
   </w:style>
-  <w:style w:type="paragraph" w:styleId="Ttulo2">
+  <w:style w:type="paragraph" w:styleId="Heading2">
     <w:name w:val="heading 2"/>
-    <w:basedOn w:val="Ttulo1"/>
+    <w:basedOn w:val="Heading1"/>
     <w:next w:val="Normal"/>
-    <w:link w:val="Ttulo2Car"/>
+    <w:link w:val="Heading2Char"/>
     <w:uiPriority w:val="9"/>
     <w:unhideWhenUsed/>
     <w:qFormat/>
@@ -6957,11 +6998,11 @@
       <w:outlineLvl w:val="1"/>
     </w:pPr>
   </w:style>
-  <w:style w:type="paragraph" w:styleId="Ttulo3">
+  <w:style w:type="paragraph" w:styleId="Heading3">
     <w:name w:val="heading 3"/>
-    <w:basedOn w:val="Ttulo1"/>
+    <w:basedOn w:val="Heading1"/>
     <w:next w:val="Normal"/>
-    <w:link w:val="Ttulo3Car"/>
+    <w:link w:val="Heading3Char"/>
     <w:uiPriority w:val="9"/>
     <w:unhideWhenUsed/>
     <w:qFormat/>
@@ -6973,11 +7014,11 @@
       <w:outlineLvl w:val="2"/>
     </w:pPr>
   </w:style>
-  <w:style w:type="paragraph" w:styleId="Ttulo4">
+  <w:style w:type="paragraph" w:styleId="Heading4">
     <w:name w:val="heading 4"/>
     <w:basedOn w:val="Normal"/>
     <w:next w:val="Normal"/>
-    <w:link w:val="Ttulo4Car"/>
+    <w:link w:val="Heading4Char"/>
     <w:uiPriority w:val="9"/>
     <w:semiHidden/>
     <w:unhideWhenUsed/>
@@ -6996,11 +7037,11 @@
       <w:color w:val="0F4761" w:themeColor="accent1" w:themeShade="BF"/>
     </w:rPr>
   </w:style>
-  <w:style w:type="paragraph" w:styleId="Ttulo5">
+  <w:style w:type="paragraph" w:styleId="Heading5">
     <w:name w:val="heading 5"/>
     <w:basedOn w:val="Normal"/>
     <w:next w:val="Normal"/>
-    <w:link w:val="Ttulo5Car"/>
+    <w:link w:val="Heading5Char"/>
     <w:uiPriority w:val="9"/>
     <w:semiHidden/>
     <w:unhideWhenUsed/>
@@ -7017,11 +7058,11 @@
       <w:color w:val="0F4761" w:themeColor="accent1" w:themeShade="BF"/>
     </w:rPr>
   </w:style>
-  <w:style w:type="paragraph" w:styleId="Ttulo6">
+  <w:style w:type="paragraph" w:styleId="Heading6">
     <w:name w:val="heading 6"/>
     <w:basedOn w:val="Normal"/>
     <w:next w:val="Normal"/>
-    <w:link w:val="Ttulo6Car"/>
+    <w:link w:val="Heading6Char"/>
     <w:uiPriority w:val="9"/>
     <w:semiHidden/>
     <w:unhideWhenUsed/>
@@ -7040,11 +7081,11 @@
       <w:color w:val="595959" w:themeColor="text1" w:themeTint="A6"/>
     </w:rPr>
   </w:style>
-  <w:style w:type="paragraph" w:styleId="Ttulo7">
+  <w:style w:type="paragraph" w:styleId="Heading7">
     <w:name w:val="heading 7"/>
     <w:basedOn w:val="Normal"/>
     <w:next w:val="Normal"/>
-    <w:link w:val="Ttulo7Car"/>
+    <w:link w:val="Heading7Char"/>
     <w:uiPriority w:val="9"/>
     <w:semiHidden/>
     <w:unhideWhenUsed/>
@@ -7061,11 +7102,11 @@
       <w:color w:val="595959" w:themeColor="text1" w:themeTint="A6"/>
     </w:rPr>
   </w:style>
-  <w:style w:type="paragraph" w:styleId="Ttulo8">
+  <w:style w:type="paragraph" w:styleId="Heading8">
     <w:name w:val="heading 8"/>
     <w:basedOn w:val="Normal"/>
     <w:next w:val="Normal"/>
-    <w:link w:val="Ttulo8Car"/>
+    <w:link w:val="Heading8Char"/>
     <w:uiPriority w:val="9"/>
     <w:semiHidden/>
     <w:unhideWhenUsed/>
@@ -7083,11 +7124,11 @@
       <w:color w:val="272727" w:themeColor="text1" w:themeTint="D8"/>
     </w:rPr>
   </w:style>
-  <w:style w:type="paragraph" w:styleId="Ttulo9">
+  <w:style w:type="paragraph" w:styleId="Heading9">
     <w:name w:val="heading 9"/>
     <w:basedOn w:val="Normal"/>
     <w:next w:val="Normal"/>
-    <w:link w:val="Ttulo9Car"/>
+    <w:link w:val="Heading9Char"/>
     <w:uiPriority w:val="9"/>
     <w:semiHidden/>
     <w:unhideWhenUsed/>
@@ -7103,13 +7144,13 @@
       <w:color w:val="272727" w:themeColor="text1" w:themeTint="D8"/>
     </w:rPr>
   </w:style>
-  <w:style w:type="character" w:default="1" w:styleId="Fuentedeprrafopredeter">
+  <w:style w:type="character" w:default="1" w:styleId="DefaultParagraphFont">
     <w:name w:val="Default Paragraph Font"/>
     <w:uiPriority w:val="1"/>
     <w:semiHidden/>
     <w:unhideWhenUsed/>
   </w:style>
-  <w:style w:type="table" w:default="1" w:styleId="Tablanormal">
+  <w:style w:type="table" w:default="1" w:styleId="TableNormal">
     <w:name w:val="Normal Table"/>
     <w:uiPriority w:val="99"/>
     <w:semiHidden/>
@@ -7124,16 +7165,16 @@
       </w:tblCellMar>
     </w:tblPr>
   </w:style>
-  <w:style w:type="numbering" w:default="1" w:styleId="Sinlista">
+  <w:style w:type="numbering" w:default="1" w:styleId="NoList">
     <w:name w:val="No List"/>
     <w:uiPriority w:val="99"/>
     <w:semiHidden/>
     <w:unhideWhenUsed/>
   </w:style>
-  <w:style w:type="character" w:customStyle="1" w:styleId="Ttulo1Car">
-    <w:name w:val="Título 1 Car"/>
-    <w:basedOn w:val="Fuentedeprrafopredeter"/>
-    <w:link w:val="Ttulo1"/>
+  <w:style w:type="character" w:customStyle="1" w:styleId="Heading1Char">
+    <w:name w:val="Heading 1 Char"/>
+    <w:basedOn w:val="DefaultParagraphFont"/>
+    <w:link w:val="Heading1"/>
     <w:uiPriority w:val="9"/>
     <w:rsid w:val="006F116F"/>
     <w:rPr>
@@ -7145,10 +7186,10 @@
       <w:lang w:val="es-ES_tradnl"/>
     </w:rPr>
   </w:style>
-  <w:style w:type="character" w:customStyle="1" w:styleId="Ttulo2Car">
-    <w:name w:val="Título 2 Car"/>
-    <w:basedOn w:val="Fuentedeprrafopredeter"/>
-    <w:link w:val="Ttulo2"/>
+  <w:style w:type="character" w:customStyle="1" w:styleId="Heading2Char">
+    <w:name w:val="Heading 2 Char"/>
+    <w:basedOn w:val="DefaultParagraphFont"/>
+    <w:link w:val="Heading2"/>
     <w:uiPriority w:val="9"/>
     <w:rsid w:val="006F116F"/>
     <w:rPr>
@@ -7160,10 +7201,10 @@
       <w:lang w:val="es-ES_tradnl"/>
     </w:rPr>
   </w:style>
-  <w:style w:type="character" w:customStyle="1" w:styleId="Ttulo3Car">
-    <w:name w:val="Título 3 Car"/>
-    <w:basedOn w:val="Fuentedeprrafopredeter"/>
-    <w:link w:val="Ttulo3"/>
+  <w:style w:type="character" w:customStyle="1" w:styleId="Heading3Char">
+    <w:name w:val="Heading 3 Char"/>
+    <w:basedOn w:val="DefaultParagraphFont"/>
+    <w:link w:val="Heading3"/>
     <w:uiPriority w:val="9"/>
     <w:rsid w:val="006F116F"/>
     <w:rPr>
@@ -7175,10 +7216,10 @@
       <w:lang w:val="es-ES_tradnl"/>
     </w:rPr>
   </w:style>
-  <w:style w:type="character" w:customStyle="1" w:styleId="Ttulo4Car">
-    <w:name w:val="Título 4 Car"/>
-    <w:basedOn w:val="Fuentedeprrafopredeter"/>
-    <w:link w:val="Ttulo4"/>
+  <w:style w:type="character" w:customStyle="1" w:styleId="Heading4Char">
+    <w:name w:val="Heading 4 Char"/>
+    <w:basedOn w:val="DefaultParagraphFont"/>
+    <w:link w:val="Heading4"/>
     <w:uiPriority w:val="9"/>
     <w:semiHidden/>
     <w:rsid w:val="002979C1"/>
@@ -7189,10 +7230,10 @@
       <w:color w:val="0F4761" w:themeColor="accent1" w:themeShade="BF"/>
     </w:rPr>
   </w:style>
-  <w:style w:type="character" w:customStyle="1" w:styleId="Ttulo5Car">
-    <w:name w:val="Título 5 Car"/>
-    <w:basedOn w:val="Fuentedeprrafopredeter"/>
-    <w:link w:val="Ttulo5"/>
+  <w:style w:type="character" w:customStyle="1" w:styleId="Heading5Char">
+    <w:name w:val="Heading 5 Char"/>
+    <w:basedOn w:val="DefaultParagraphFont"/>
+    <w:link w:val="Heading5"/>
     <w:uiPriority w:val="9"/>
     <w:semiHidden/>
     <w:rsid w:val="002979C1"/>
@@ -7201,10 +7242,10 @@
       <w:color w:val="0F4761" w:themeColor="accent1" w:themeShade="BF"/>
     </w:rPr>
   </w:style>
-  <w:style w:type="character" w:customStyle="1" w:styleId="Ttulo6Car">
-    <w:name w:val="Título 6 Car"/>
-    <w:basedOn w:val="Fuentedeprrafopredeter"/>
-    <w:link w:val="Ttulo6"/>
+  <w:style w:type="character" w:customStyle="1" w:styleId="Heading6Char">
+    <w:name w:val="Heading 6 Char"/>
+    <w:basedOn w:val="DefaultParagraphFont"/>
+    <w:link w:val="Heading6"/>
     <w:uiPriority w:val="9"/>
     <w:semiHidden/>
     <w:rsid w:val="002979C1"/>
@@ -7215,10 +7256,10 @@
       <w:color w:val="595959" w:themeColor="text1" w:themeTint="A6"/>
     </w:rPr>
   </w:style>
-  <w:style w:type="character" w:customStyle="1" w:styleId="Ttulo7Car">
-    <w:name w:val="Título 7 Car"/>
-    <w:basedOn w:val="Fuentedeprrafopredeter"/>
-    <w:link w:val="Ttulo7"/>
+  <w:style w:type="character" w:customStyle="1" w:styleId="Heading7Char">
+    <w:name w:val="Heading 7 Char"/>
+    <w:basedOn w:val="DefaultParagraphFont"/>
+    <w:link w:val="Heading7"/>
     <w:uiPriority w:val="9"/>
     <w:semiHidden/>
     <w:rsid w:val="002979C1"/>
@@ -7227,10 +7268,10 @@
       <w:color w:val="595959" w:themeColor="text1" w:themeTint="A6"/>
     </w:rPr>
   </w:style>
-  <w:style w:type="character" w:customStyle="1" w:styleId="Ttulo8Car">
-    <w:name w:val="Título 8 Car"/>
-    <w:basedOn w:val="Fuentedeprrafopredeter"/>
-    <w:link w:val="Ttulo8"/>
+  <w:style w:type="character" w:customStyle="1" w:styleId="Heading8Char">
+    <w:name w:val="Heading 8 Char"/>
+    <w:basedOn w:val="DefaultParagraphFont"/>
+    <w:link w:val="Heading8"/>
     <w:uiPriority w:val="9"/>
     <w:semiHidden/>
     <w:rsid w:val="002979C1"/>
@@ -7241,10 +7282,10 @@
       <w:color w:val="272727" w:themeColor="text1" w:themeTint="D8"/>
     </w:rPr>
   </w:style>
-  <w:style w:type="character" w:customStyle="1" w:styleId="Ttulo9Car">
-    <w:name w:val="Título 9 Car"/>
-    <w:basedOn w:val="Fuentedeprrafopredeter"/>
-    <w:link w:val="Ttulo9"/>
+  <w:style w:type="character" w:customStyle="1" w:styleId="Heading9Char">
+    <w:name w:val="Heading 9 Char"/>
+    <w:basedOn w:val="DefaultParagraphFont"/>
+    <w:link w:val="Heading9"/>
     <w:uiPriority w:val="9"/>
     <w:semiHidden/>
     <w:rsid w:val="002979C1"/>
@@ -7253,11 +7294,11 @@
       <w:color w:val="272727" w:themeColor="text1" w:themeTint="D8"/>
     </w:rPr>
   </w:style>
-  <w:style w:type="paragraph" w:styleId="Ttulo">
+  <w:style w:type="paragraph" w:styleId="Title">
     <w:name w:val="Title"/>
     <w:basedOn w:val="Normal"/>
     <w:next w:val="Normal"/>
-    <w:link w:val="TtuloCar"/>
+    <w:link w:val="TitleChar"/>
     <w:uiPriority w:val="10"/>
     <w:qFormat/>
     <w:rsid w:val="002979C1"/>
@@ -7273,10 +7314,10 @@
       <w:szCs w:val="56"/>
     </w:rPr>
   </w:style>
-  <w:style w:type="character" w:customStyle="1" w:styleId="TtuloCar">
-    <w:name w:val="Título Car"/>
-    <w:basedOn w:val="Fuentedeprrafopredeter"/>
-    <w:link w:val="Ttulo"/>
+  <w:style w:type="character" w:customStyle="1" w:styleId="TitleChar">
+    <w:name w:val="Title Char"/>
+    <w:basedOn w:val="DefaultParagraphFont"/>
+    <w:link w:val="Title"/>
     <w:uiPriority w:val="10"/>
     <w:rsid w:val="002979C1"/>
     <w:rPr>
@@ -7287,11 +7328,11 @@
       <w:szCs w:val="56"/>
     </w:rPr>
   </w:style>
-  <w:style w:type="paragraph" w:styleId="Subttulo">
+  <w:style w:type="paragraph" w:styleId="Subtitle">
     <w:name w:val="Subtitle"/>
     <w:basedOn w:val="Normal"/>
     <w:next w:val="Normal"/>
-    <w:link w:val="SubttuloCar"/>
+    <w:link w:val="SubtitleChar"/>
     <w:uiPriority w:val="11"/>
     <w:qFormat/>
     <w:rsid w:val="002979C1"/>
@@ -7309,10 +7350,10 @@
       <w:szCs w:val="28"/>
     </w:rPr>
   </w:style>
-  <w:style w:type="character" w:customStyle="1" w:styleId="SubttuloCar">
-    <w:name w:val="Subtítulo Car"/>
-    <w:basedOn w:val="Fuentedeprrafopredeter"/>
-    <w:link w:val="Subttulo"/>
+  <w:style w:type="character" w:customStyle="1" w:styleId="SubtitleChar">
+    <w:name w:val="Subtitle Char"/>
+    <w:basedOn w:val="DefaultParagraphFont"/>
+    <w:link w:val="Subtitle"/>
     <w:uiPriority w:val="11"/>
     <w:rsid w:val="002979C1"/>
     <w:rPr>
@@ -7323,11 +7364,11 @@
       <w:szCs w:val="28"/>
     </w:rPr>
   </w:style>
-  <w:style w:type="paragraph" w:styleId="Cita">
+  <w:style w:type="paragraph" w:styleId="Quote">
     <w:name w:val="Quote"/>
     <w:basedOn w:val="Normal"/>
     <w:next w:val="Normal"/>
-    <w:link w:val="CitaCar"/>
+    <w:link w:val="QuoteChar"/>
     <w:uiPriority w:val="29"/>
     <w:qFormat/>
     <w:rsid w:val="002979C1"/>
@@ -7341,10 +7382,10 @@
       <w:color w:val="404040" w:themeColor="text1" w:themeTint="BF"/>
     </w:rPr>
   </w:style>
-  <w:style w:type="character" w:customStyle="1" w:styleId="CitaCar">
-    <w:name w:val="Cita Car"/>
-    <w:basedOn w:val="Fuentedeprrafopredeter"/>
-    <w:link w:val="Cita"/>
+  <w:style w:type="character" w:customStyle="1" w:styleId="QuoteChar">
+    <w:name w:val="Quote Char"/>
+    <w:basedOn w:val="DefaultParagraphFont"/>
+    <w:link w:val="Quote"/>
     <w:uiPriority w:val="29"/>
     <w:rsid w:val="002979C1"/>
     <w:rPr>
@@ -7353,7 +7394,7 @@
       <w:color w:val="404040" w:themeColor="text1" w:themeTint="BF"/>
     </w:rPr>
   </w:style>
-  <w:style w:type="paragraph" w:styleId="Prrafodelista">
+  <w:style w:type="paragraph" w:styleId="ListParagraph">
     <w:name w:val="List Paragraph"/>
     <w:basedOn w:val="Normal"/>
     <w:uiPriority w:val="34"/>
@@ -7364,9 +7405,9 @@
       <w:contextualSpacing/>
     </w:pPr>
   </w:style>
-  <w:style w:type="character" w:styleId="nfasisintenso">
+  <w:style w:type="character" w:styleId="IntenseEmphasis">
     <w:name w:val="Intense Emphasis"/>
-    <w:basedOn w:val="Fuentedeprrafopredeter"/>
+    <w:basedOn w:val="DefaultParagraphFont"/>
     <w:uiPriority w:val="21"/>
     <w:qFormat/>
     <w:rsid w:val="002979C1"/>
@@ -7376,11 +7417,11 @@
       <w:color w:val="0F4761" w:themeColor="accent1" w:themeShade="BF"/>
     </w:rPr>
   </w:style>
-  <w:style w:type="paragraph" w:styleId="Citadestacada">
+  <w:style w:type="paragraph" w:styleId="IntenseQuote">
     <w:name w:val="Intense Quote"/>
     <w:basedOn w:val="Normal"/>
     <w:next w:val="Normal"/>
-    <w:link w:val="CitadestacadaCar"/>
+    <w:link w:val="IntenseQuoteChar"/>
     <w:uiPriority w:val="30"/>
     <w:qFormat/>
     <w:rsid w:val="002979C1"/>
@@ -7399,10 +7440,10 @@
       <w:color w:val="0F4761" w:themeColor="accent1" w:themeShade="BF"/>
     </w:rPr>
   </w:style>
-  <w:style w:type="character" w:customStyle="1" w:styleId="CitadestacadaCar">
-    <w:name w:val="Cita destacada Car"/>
-    <w:basedOn w:val="Fuentedeprrafopredeter"/>
-    <w:link w:val="Citadestacada"/>
+  <w:style w:type="character" w:customStyle="1" w:styleId="IntenseQuoteChar">
+    <w:name w:val="Intense Quote Char"/>
+    <w:basedOn w:val="DefaultParagraphFont"/>
+    <w:link w:val="IntenseQuote"/>
     <w:uiPriority w:val="30"/>
     <w:rsid w:val="002979C1"/>
     <w:rPr>
@@ -7411,9 +7452,9 @@
       <w:color w:val="0F4761" w:themeColor="accent1" w:themeShade="BF"/>
     </w:rPr>
   </w:style>
-  <w:style w:type="character" w:styleId="Referenciaintensa">
+  <w:style w:type="character" w:styleId="IntenseReference">
     <w:name w:val="Intense Reference"/>
-    <w:basedOn w:val="Fuentedeprrafopredeter"/>
+    <w:basedOn w:val="DefaultParagraphFont"/>
     <w:uiPriority w:val="32"/>
     <w:qFormat/>
     <w:rsid w:val="002979C1"/>
@@ -7425,10 +7466,10 @@
       <w:spacing w:val="5"/>
     </w:rPr>
   </w:style>
-  <w:style w:type="paragraph" w:styleId="Encabezado">
+  <w:style w:type="paragraph" w:styleId="Header">
     <w:name w:val="header"/>
     <w:basedOn w:val="Normal"/>
-    <w:link w:val="EncabezadoCar"/>
+    <w:link w:val="HeaderChar"/>
     <w:uiPriority w:val="99"/>
     <w:unhideWhenUsed/>
     <w:rsid w:val="002979C1"/>
@@ -7439,17 +7480,17 @@
       </w:tabs>
     </w:pPr>
   </w:style>
-  <w:style w:type="character" w:customStyle="1" w:styleId="EncabezadoCar">
-    <w:name w:val="Encabezado Car"/>
-    <w:basedOn w:val="Fuentedeprrafopredeter"/>
-    <w:link w:val="Encabezado"/>
+  <w:style w:type="character" w:customStyle="1" w:styleId="HeaderChar">
+    <w:name w:val="Header Char"/>
+    <w:basedOn w:val="DefaultParagraphFont"/>
+    <w:link w:val="Header"/>
     <w:uiPriority w:val="99"/>
     <w:rsid w:val="002979C1"/>
   </w:style>
-  <w:style w:type="paragraph" w:styleId="Piedepgina">
+  <w:style w:type="paragraph" w:styleId="Footer">
     <w:name w:val="footer"/>
     <w:basedOn w:val="Normal"/>
-    <w:link w:val="PiedepginaCar"/>
+    <w:link w:val="FooterChar"/>
     <w:uiPriority w:val="99"/>
     <w:unhideWhenUsed/>
     <w:rsid w:val="002979C1"/>
@@ -7460,24 +7501,24 @@
       </w:tabs>
     </w:pPr>
   </w:style>
-  <w:style w:type="character" w:customStyle="1" w:styleId="PiedepginaCar">
-    <w:name w:val="Pie de página Car"/>
-    <w:basedOn w:val="Fuentedeprrafopredeter"/>
-    <w:link w:val="Piedepgina"/>
+  <w:style w:type="character" w:customStyle="1" w:styleId="FooterChar">
+    <w:name w:val="Footer Char"/>
+    <w:basedOn w:val="DefaultParagraphFont"/>
+    <w:link w:val="Footer"/>
     <w:uiPriority w:val="99"/>
     <w:rsid w:val="002979C1"/>
   </w:style>
-  <w:style w:type="character" w:styleId="Nmerodepgina">
+  <w:style w:type="character" w:styleId="PageNumber">
     <w:name w:val="page number"/>
-    <w:basedOn w:val="Fuentedeprrafopredeter"/>
+    <w:basedOn w:val="DefaultParagraphFont"/>
     <w:uiPriority w:val="99"/>
     <w:semiHidden/>
     <w:unhideWhenUsed/>
     <w:rsid w:val="002979C1"/>
   </w:style>
-  <w:style w:type="table" w:styleId="Tablaconcuadrcula">
+  <w:style w:type="table" w:styleId="TableGrid">
     <w:name w:val="Table Grid"/>
-    <w:basedOn w:val="Tablanormal"/>
+    <w:basedOn w:val="TableNormal"/>
     <w:uiPriority w:val="39"/>
     <w:rsid w:val="002979C1"/>
     <w:tblPr>
@@ -7491,9 +7532,9 @@
       </w:tblBorders>
     </w:tblPr>
   </w:style>
-  <w:style w:type="character" w:styleId="Hipervnculo">
+  <w:style w:type="character" w:styleId="Hyperlink">
     <w:name w:val="Hyperlink"/>
-    <w:basedOn w:val="Fuentedeprrafopredeter"/>
+    <w:basedOn w:val="DefaultParagraphFont"/>
     <w:uiPriority w:val="99"/>
     <w:unhideWhenUsed/>
     <w:rsid w:val="009861DA"/>
@@ -7502,9 +7543,9 @@
       <w:u w:val="single"/>
     </w:rPr>
   </w:style>
-  <w:style w:type="character" w:styleId="Mencinsinresolver">
+  <w:style w:type="character" w:styleId="UnresolvedMention">
     <w:name w:val="Unresolved Mention"/>
-    <w:basedOn w:val="Fuentedeprrafopredeter"/>
+    <w:basedOn w:val="DefaultParagraphFont"/>
     <w:uiPriority w:val="99"/>
     <w:semiHidden/>
     <w:unhideWhenUsed/>
@@ -7534,7 +7575,7 @@
       <w14:ligatures w14:val="none"/>
     </w:rPr>
   </w:style>
-  <w:style w:type="paragraph" w:styleId="TDC1">
+  <w:style w:type="paragraph" w:styleId="TOC1">
     <w:name w:val="toc 1"/>
     <w:basedOn w:val="Normal"/>
     <w:next w:val="Normal"/>
@@ -7556,7 +7597,7 @@
       <w:iCs/>
     </w:rPr>
   </w:style>
-  <w:style w:type="paragraph" w:styleId="TDC2">
+  <w:style w:type="paragraph" w:styleId="TOC2">
     <w:name w:val="toc 2"/>
     <w:basedOn w:val="Normal"/>
     <w:next w:val="Normal"/>
@@ -7579,7 +7620,7 @@
       <w:szCs w:val="22"/>
     </w:rPr>
   </w:style>
-  <w:style w:type="paragraph" w:styleId="TDC3">
+  <w:style w:type="paragraph" w:styleId="TOC3">
     <w:name w:val="toc 3"/>
     <w:basedOn w:val="Normal"/>
     <w:next w:val="Normal"/>
@@ -7599,7 +7640,7 @@
       <w:szCs w:val="20"/>
     </w:rPr>
   </w:style>
-  <w:style w:type="paragraph" w:styleId="TDC4">
+  <w:style w:type="paragraph" w:styleId="TOC4">
     <w:name w:val="toc 4"/>
     <w:basedOn w:val="Normal"/>
     <w:next w:val="Normal"/>
@@ -7619,7 +7660,7 @@
       <w:szCs w:val="20"/>
     </w:rPr>
   </w:style>
-  <w:style w:type="paragraph" w:styleId="TDC5">
+  <w:style w:type="paragraph" w:styleId="TOC5">
     <w:name w:val="toc 5"/>
     <w:basedOn w:val="Normal"/>
     <w:next w:val="Normal"/>
@@ -7639,7 +7680,7 @@
       <w:szCs w:val="20"/>
     </w:rPr>
   </w:style>
-  <w:style w:type="paragraph" w:styleId="TDC6">
+  <w:style w:type="paragraph" w:styleId="TOC6">
     <w:name w:val="toc 6"/>
     <w:basedOn w:val="Normal"/>
     <w:next w:val="Normal"/>
@@ -7659,7 +7700,7 @@
       <w:szCs w:val="20"/>
     </w:rPr>
   </w:style>
-  <w:style w:type="paragraph" w:styleId="TDC7">
+  <w:style w:type="paragraph" w:styleId="TOC7">
     <w:name w:val="toc 7"/>
     <w:basedOn w:val="Normal"/>
     <w:next w:val="Normal"/>
@@ -7679,7 +7720,7 @@
       <w:szCs w:val="20"/>
     </w:rPr>
   </w:style>
-  <w:style w:type="paragraph" w:styleId="TDC8">
+  <w:style w:type="paragraph" w:styleId="TOC8">
     <w:name w:val="toc 8"/>
     <w:basedOn w:val="Normal"/>
     <w:next w:val="Normal"/>
@@ -7699,7 +7740,7 @@
       <w:szCs w:val="20"/>
     </w:rPr>
   </w:style>
-  <w:style w:type="paragraph" w:styleId="TDC9">
+  <w:style w:type="paragraph" w:styleId="TOC9">
     <w:name w:val="toc 9"/>
     <w:basedOn w:val="Normal"/>
     <w:next w:val="Normal"/>
@@ -7719,7 +7760,7 @@
       <w:szCs w:val="20"/>
     </w:rPr>
   </w:style>
-  <w:style w:type="paragraph" w:styleId="Sinespaciado">
+  <w:style w:type="paragraph" w:styleId="NoSpacing">
     <w:name w:val="No Spacing"/>
     <w:uiPriority w:val="1"/>
     <w:qFormat/>

</xml_diff>